<commit_message>
new logo and resume updates
</commit_message>
<xml_diff>
--- a/Adrian - ATS CL.docx
+++ b/Adrian - ATS CL.docx
@@ -258,7 +258,7 @@
           <w:szCs w:val="24"/>
           <w:lang w:val="en-GB" w:eastAsia="de-DE"/>
         </w:rPr>
-        <w:t>I have a strong passion for software architecture and programming. I've led successful projects, specializing in designing scalable and efficient systems. I stand out not just for my technical skills but also my love for learning. I thrive on challenges and can adapt swiftly to new technologies. Let's discuss how my skills can benefit your team's success.</w:t>
+        <w:t>I have a strong passion for software architecture and programming. I've led successful projects, specializing in designing scalable and efficient systems. I stand out not just for my technical skills but also for my love for learning. I thrive on challenges and can adapt swiftly to new technologies. Let's discuss how my skills can benefit your team's success.</w:t>
       </w:r>
     </w:p>
     <w:p>
@@ -291,7 +291,7 @@
           <w:szCs w:val="24"/>
           <w:lang w:val="en-GB" w:eastAsia="de-DE"/>
         </w:rPr>
-        <w:t>I am performance-oriented, driven by technology, and committed to the organization’s success. Besides my collaborative nature, I have exceptional communication, listening, and interpersonal skills. My quick-thinking style helps me make decisions in a short time frame and perform well in a fast-paced, deadline-oriented environment. Given the opportunity, I am confident of achieving ground-breaking results and surpassing your expectations.</w:t>
+        <w:t>I am performance-oriented, driven by technology, and committed to the organization’s success. Besides my collaborative nature, I have exceptional communication, listening, and interpersonal skills. My quick-thinking style helps me make decisions quickly and perform well in a fast-paced, deadline-oriented environment. Given the opportunity, I am confident of achieving ground-breaking results and surpassing your expectations.</w:t>
       </w:r>
     </w:p>
     <w:p>
@@ -335,18 +335,6 @@
         </w:rPr>
         <w:t>Thank you for your time and consideration.</w:t>
       </w:r>
-    </w:p>
-    <w:p>
-      <w:pPr>
-        <w:spacing w:after="0" w:line="240" w:lineRule="auto"/>
-        <w:jc w:val="both"/>
-        <w:rPr>
-          <w:rFonts w:eastAsia="MS Mincho" w:cstheme="minorHAnsi"/>
-          <w:sz w:val="24"/>
-          <w:szCs w:val="24"/>
-          <w:lang w:val="en-GB" w:eastAsia="de-DE"/>
-        </w:rPr>
-      </w:pPr>
     </w:p>
     <w:p>
       <w:pPr>

</xml_diff>